<commit_message>
Show my current location as a readable address on the destination tab
Adds a "내 위치: <주소>" label above the destination search box,
reverse-geocoded from the GPS coordinates via kakao.maps.services.Geocoder.
The map silently recentering wasn't a visible-enough signal that
location was found (especially with the keyboard covering the map on
mobile), so this gives explicit confirmation - and a clear "위치 권한을
허용해주세요" message when it fails.

Co-Authored-By: Claude Sonnet 5 <noreply@anthropic.com>
</commit_message>
<xml_diff>
--- a/전운보초_기획개요.docx
+++ b/전운보초_기획개요.docx
@@ -68,7 +68,7 @@
         <w:rPr>
           <w:color w:val="59564C"/>
         </w:rPr>
-        <w:t xml:space="preserve"> 그대로 따온 이름. 면허를 막 딴 사람이 몇 달만 쓰고 자연스럽게 졸업하는, 실</w:t>
+        <w:t xml:space="preserve"> 그대로 따온 이름. 면허를 막 딴 사람이 실</w:t>
       </w:r>
       <w:r>
         <w:rPr>
@@ -112,12 +112,6 @@
         <w:gridCol w:w="6939"/>
       </w:tblGrid>
       <w:tr>
-        <w:tblPrEx>
-          <w:tblCellMar>
-            <w:top w:w="0" w:type="dxa"/>
-            <w:bottom w:w="0" w:type="dxa"/>
-          </w:tblCellMar>
-        </w:tblPrEx>
         <w:tc>
           <w:tcPr>
             <w:tcW w:w="2699" w:type="dxa"/>
@@ -191,12 +185,6 @@
         </w:tc>
       </w:tr>
       <w:tr>
-        <w:tblPrEx>
-          <w:tblCellMar>
-            <w:top w:w="0" w:type="dxa"/>
-            <w:bottom w:w="0" w:type="dxa"/>
-          </w:tblCellMar>
-        </w:tblPrEx>
         <w:tc>
           <w:tcPr>
             <w:tcW w:w="2699" w:type="dxa"/>
@@ -255,12 +243,6 @@
         </w:tc>
       </w:tr>
       <w:tr>
-        <w:tblPrEx>
-          <w:tblCellMar>
-            <w:top w:w="0" w:type="dxa"/>
-            <w:bottom w:w="0" w:type="dxa"/>
-          </w:tblCellMar>
-        </w:tblPrEx>
         <w:tc>
           <w:tcPr>
             <w:tcW w:w="2699" w:type="dxa"/>
@@ -342,12 +324,6 @@
         </w:tc>
       </w:tr>
       <w:tr>
-        <w:tblPrEx>
-          <w:tblCellMar>
-            <w:top w:w="0" w:type="dxa"/>
-            <w:bottom w:w="0" w:type="dxa"/>
-          </w:tblCellMar>
-        </w:tblPrEx>
         <w:tc>
           <w:tcPr>
             <w:tcW w:w="2699" w:type="dxa"/>
@@ -406,12 +382,6 @@
         </w:tc>
       </w:tr>
       <w:tr>
-        <w:tblPrEx>
-          <w:tblCellMar>
-            <w:top w:w="0" w:type="dxa"/>
-            <w:bottom w:w="0" w:type="dxa"/>
-          </w:tblCellMar>
-        </w:tblPrEx>
         <w:tc>
           <w:tcPr>
             <w:tcW w:w="2699" w:type="dxa"/>
@@ -542,7 +512,43 @@
           <w:iCs/>
           <w:color w:val="59564C"/>
         </w:rPr>
-        <w:t xml:space="preserve"> 대체하는 일상 내비게이션이 아니라, 정해진 기간만 쓰는 한시적 보조 도구로 목적을 확정했다.</w:t>
+        <w:t xml:space="preserve"> 대체하는 일상 내비게이션이 </w:t>
+      </w:r>
+      <w:proofErr w:type="gramStart"/>
+      <w:r>
+        <w:rPr>
+          <w:i/>
+          <w:iCs/>
+          <w:color w:val="59564C"/>
+        </w:rPr>
+        <w:t xml:space="preserve">아니라, </w:t>
+      </w:r>
+      <w:r>
+        <w:rPr>
+          <w:rFonts w:hint="eastAsia"/>
+          <w:i/>
+          <w:iCs/>
+          <w:color w:val="59564C"/>
+        </w:rPr>
+        <w:t xml:space="preserve"> 도로</w:t>
+      </w:r>
+      <w:proofErr w:type="gramEnd"/>
+      <w:r>
+        <w:rPr>
+          <w:rFonts w:hint="eastAsia"/>
+          <w:i/>
+          <w:iCs/>
+          <w:color w:val="59564C"/>
+        </w:rPr>
+        <w:t xml:space="preserve"> 상황에 익숙하지 않은 초보를 위한 </w:t>
+      </w:r>
+      <w:r>
+        <w:rPr>
+          <w:i/>
+          <w:iCs/>
+          <w:color w:val="59564C"/>
+        </w:rPr>
+        <w:t>보조 도구로 목적을 확정했다.</w:t>
       </w:r>
     </w:p>
     <w:p>
@@ -558,7 +564,34 @@
       </w:r>
       <w:proofErr w:type="spellEnd"/>
       <w:r>
-        <w:t xml:space="preserve"> “연습하기 좋은 길”과 “사전 안내”</w:t>
+        <w:t xml:space="preserve"> </w:t>
+      </w:r>
+      <w:r>
+        <w:t>‘</w:t>
+      </w:r>
+      <w:r>
+        <w:t>연습하기 좋은 길</w:t>
+      </w:r>
+      <w:r>
+        <w:t>’</w:t>
+      </w:r>
+      <w:r>
+        <w:t xml:space="preserve">과 </w:t>
+      </w:r>
+      <w:r>
+        <w:t>‘</w:t>
+      </w:r>
+      <w:r>
+        <w:rPr>
+          <w:rFonts w:hint="eastAsia"/>
+        </w:rPr>
+        <w:t>친절한 사전</w:t>
+      </w:r>
+      <w:r>
+        <w:t xml:space="preserve"> 안내</w:t>
+      </w:r>
+      <w:r>
+        <w:t>’</w:t>
       </w:r>
       <w:proofErr w:type="spellStart"/>
       <w:r>
@@ -566,7 +599,7 @@
       </w:r>
       <w:proofErr w:type="spellEnd"/>
       <w:r>
-        <w:t xml:space="preserve"> 집중한다. 사용자가 매일 쓰는 메인 내비게이션이 되려는 것이 아니라, 면허 취득 직후 몇 달간 도로 감각을 붙이기 위해 쓰고, 운전이 익숙해지면 자연스럽게 더는 열지 않게 되는 것을 정상적인 결말로 본다. 이렇게 목적을 좁히면 기능②(실시간 안내)를 포함한 모든 기능이 “연습” 하나의 맥락으로 통일되고, 일상 내비게이션과 경쟁할 필요가 없어진다.</w:t>
+        <w:t xml:space="preserve"> 집중한다. 사용자가 매일 쓰는 메인 내비게이션이 되려는 것이 아니라, 면허 취득 직후 도로 감각을 붙이기 위해 쓰고, 운전이 익숙해지면 자연스럽게 더는 열지 않게 되는 것을 정상적인 결말로 본다. 이렇게 목적을 좁히면 기능②(실시간 안내)를 포함한 모든 기능이 “연습” 하나의 맥락으로 통일되고, 일상 내비게이션과 경쟁할 필요가 없어진다.</w:t>
       </w:r>
     </w:p>
     <w:p>
@@ -618,12 +651,6 @@
         <w:gridCol w:w="9638"/>
       </w:tblGrid>
       <w:tr>
-        <w:tblPrEx>
-          <w:tblCellMar>
-            <w:top w:w="0" w:type="dxa"/>
-            <w:bottom w:w="0" w:type="dxa"/>
-          </w:tblCellMar>
-        </w:tblPrEx>
         <w:tc>
           <w:tcPr>
             <w:tcW w:w="9638" w:type="dxa"/>
@@ -726,6 +753,16 @@
           <w:sz w:val="30"/>
           <w:szCs w:val="30"/>
         </w:rPr>
+        <w:br w:type="column"/>
+      </w:r>
+      <w:r>
+        <w:rPr>
+          <w:b/>
+          <w:bCs/>
+          <w:color w:val="2F5A73"/>
+          <w:sz w:val="30"/>
+          <w:szCs w:val="30"/>
+        </w:rPr>
         <w:lastRenderedPageBreak/>
         <w:t xml:space="preserve">2. </w:t>
       </w:r>
@@ -785,9 +822,6 @@
     <w:p>
       <w:pPr>
         <w:spacing w:after="100"/>
-        <w:rPr>
-          <w:rFonts w:hint="eastAsia"/>
-        </w:rPr>
       </w:pPr>
       <w:r>
         <w:t xml:space="preserve">왕복 6차선 이상 직진 위주(입문) → 신호·좌우회전 포함 시내 도로(초급) → 고가 </w:t>
@@ -847,12 +881,6 @@
         <w:gridCol w:w="7132"/>
       </w:tblGrid>
       <w:tr>
-        <w:tblPrEx>
-          <w:tblCellMar>
-            <w:top w:w="0" w:type="dxa"/>
-            <w:bottom w:w="0" w:type="dxa"/>
-          </w:tblCellMar>
-        </w:tblPrEx>
         <w:tc>
           <w:tcPr>
             <w:tcW w:w="2506" w:type="dxa"/>
@@ -911,12 +939,6 @@
         </w:tc>
       </w:tr>
       <w:tr>
-        <w:tblPrEx>
-          <w:tblCellMar>
-            <w:top w:w="0" w:type="dxa"/>
-            <w:bottom w:w="0" w:type="dxa"/>
-          </w:tblCellMar>
-        </w:tblPrEx>
         <w:tc>
           <w:tcPr>
             <w:tcW w:w="2506" w:type="dxa"/>
@@ -975,12 +997,6 @@
         </w:tc>
       </w:tr>
       <w:tr>
-        <w:tblPrEx>
-          <w:tblCellMar>
-            <w:top w:w="0" w:type="dxa"/>
-            <w:bottom w:w="0" w:type="dxa"/>
-          </w:tblCellMar>
-        </w:tblPrEx>
         <w:tc>
           <w:tcPr>
             <w:tcW w:w="2506" w:type="dxa"/>
@@ -1116,12 +1132,6 @@
         <w:gridCol w:w="7807"/>
       </w:tblGrid>
       <w:tr>
-        <w:tblPrEx>
-          <w:tblCellMar>
-            <w:top w:w="0" w:type="dxa"/>
-            <w:bottom w:w="0" w:type="dxa"/>
-          </w:tblCellMar>
-        </w:tblPrEx>
         <w:trPr>
           <w:cantSplit/>
         </w:trPr>
@@ -1249,12 +1259,6 @@
         </w:tc>
       </w:tr>
       <w:tr>
-        <w:tblPrEx>
-          <w:tblCellMar>
-            <w:top w:w="0" w:type="dxa"/>
-            <w:bottom w:w="0" w:type="dxa"/>
-          </w:tblCellMar>
-        </w:tblPrEx>
         <w:trPr>
           <w:cantSplit/>
         </w:trPr>
@@ -1400,12 +1404,6 @@
         </w:tc>
       </w:tr>
       <w:tr>
-        <w:tblPrEx>
-          <w:tblCellMar>
-            <w:top w:w="0" w:type="dxa"/>
-            <w:bottom w:w="0" w:type="dxa"/>
-          </w:tblCellMar>
-        </w:tblPrEx>
         <w:trPr>
           <w:cantSplit/>
         </w:trPr>
@@ -1609,11 +1607,11 @@
         <w:spacing w:after="160"/>
       </w:pPr>
       <w:r>
-        <w:t xml:space="preserve">현재 위치를 출발지이자 목적지로 지정하고 시간/거리(20분 코스, 5km 코스 등)만 고르면, 크게 한 바퀴 돌아 제자리로 돌아오는 순환 코스를 자동 생성한다. 출발했던 위치로 돌아오면 기초 주차 팁까지 </w:t>
+        <w:t>현재 위치를 출발지이자 목적지로 지정하고 시간/거리(20분 코스, 5km 코스 등)만 고르면, 크게 한 바</w:t>
       </w:r>
       <w:r>
         <w:lastRenderedPageBreak/>
-        <w:t>안내하며 마무리한다.</w:t>
+        <w:t>퀴 돌아 제자리로 돌아오는 순환 코스를 자동 생성한다. 출발했던 위치로 돌아오면 기초 주차 팁까지 안내하며 마무리한다.</w:t>
       </w:r>
     </w:p>
     <w:p>
@@ -1701,12 +1699,6 @@
         <w:gridCol w:w="7325"/>
       </w:tblGrid>
       <w:tr>
-        <w:tblPrEx>
-          <w:tblCellMar>
-            <w:top w:w="0" w:type="dxa"/>
-            <w:bottom w:w="0" w:type="dxa"/>
-          </w:tblCellMar>
-        </w:tblPrEx>
         <w:trPr>
           <w:tblHeader/>
         </w:trPr>
@@ -1772,12 +1764,6 @@
         </w:tc>
       </w:tr>
       <w:tr>
-        <w:tblPrEx>
-          <w:tblCellMar>
-            <w:top w:w="0" w:type="dxa"/>
-            <w:bottom w:w="0" w:type="dxa"/>
-          </w:tblCellMar>
-        </w:tblPrEx>
         <w:trPr>
           <w:cantSplit/>
         </w:trPr>
@@ -1838,12 +1824,6 @@
         </w:tc>
       </w:tr>
       <w:tr>
-        <w:tblPrEx>
-          <w:tblCellMar>
-            <w:top w:w="0" w:type="dxa"/>
-            <w:bottom w:w="0" w:type="dxa"/>
-          </w:tblCellMar>
-        </w:tblPrEx>
         <w:trPr>
           <w:cantSplit/>
         </w:trPr>
@@ -1951,12 +1931,6 @@
         </w:tc>
       </w:tr>
       <w:tr>
-        <w:tblPrEx>
-          <w:tblCellMar>
-            <w:top w:w="0" w:type="dxa"/>
-            <w:bottom w:w="0" w:type="dxa"/>
-          </w:tblCellMar>
-        </w:tblPrEx>
         <w:trPr>
           <w:cantSplit/>
         </w:trPr>
@@ -2172,12 +2146,6 @@
         <w:gridCol w:w="9638"/>
       </w:tblGrid>
       <w:tr>
-        <w:tblPrEx>
-          <w:tblCellMar>
-            <w:top w:w="0" w:type="dxa"/>
-            <w:bottom w:w="0" w:type="dxa"/>
-          </w:tblCellMar>
-        </w:tblPrEx>
         <w:tc>
           <w:tcPr>
             <w:tcW w:w="9638" w:type="dxa"/>
@@ -2217,7 +2185,7 @@
                 <w:sz w:val="20"/>
                 <w:szCs w:val="20"/>
               </w:rPr>
-              <w:t xml:space="preserve">①·②·④는 기존 지도 API가 주는 경로 결과를 가공·재구성하는 선에서 구현 가능하다. ③(특정 요소 포함 경로 추천)만이 노드/링크 데이터를 다뤄야 하는 진짜 자체 라우팅 기능이다. 첫 앱 프로젝트에서 </w:t>
+              <w:t>①·②·④는 기존 지도 API가 주는 경로 결과를 가공·재구성하는 선에서 구현 가능하다. ③(특정 요소 포</w:t>
             </w:r>
             <w:r>
               <w:rPr>
@@ -2226,7 +2194,7 @@
                 <w:szCs w:val="20"/>
               </w:rPr>
               <w:lastRenderedPageBreak/>
-              <w:t>완성을 목표로 한다면, ③을 나중 단계로 미루는 것이 현실적이다.</w:t>
+              <w:t>함 경로 추천)만이 노드/링크 데이터를 다뤄야 하는 진짜 자체 라우팅 기능이다. 첫 앱 프로젝트에서 완성을 목표로 한다면, ③을 나중 단계로 미루는 것이 현실적이다.</w:t>
             </w:r>
           </w:p>
         </w:tc>
@@ -2395,12 +2363,6 @@
         <w:gridCol w:w="9638"/>
       </w:tblGrid>
       <w:tr>
-        <w:tblPrEx>
-          <w:tblCellMar>
-            <w:top w:w="0" w:type="dxa"/>
-            <w:bottom w:w="0" w:type="dxa"/>
-          </w:tblCellMar>
-        </w:tblPrEx>
         <w:tc>
           <w:tcPr>
             <w:tcW w:w="9638" w:type="dxa"/>
@@ -2587,7 +2549,6 @@
           <w:sz w:val="25"/>
           <w:szCs w:val="25"/>
         </w:rPr>
-        <w:lastRenderedPageBreak/>
         <w:t>Phase 3 · 스트레치 — 자체 라우팅 로직에 도전</w:t>
       </w:r>
     </w:p>
@@ -2675,12 +2636,6 @@
         <w:gridCol w:w="9638"/>
       </w:tblGrid>
       <w:tr>
-        <w:tblPrEx>
-          <w:tblCellMar>
-            <w:top w:w="0" w:type="dxa"/>
-            <w:bottom w:w="0" w:type="dxa"/>
-          </w:tblCellMar>
-        </w:tblPrEx>
         <w:tc>
           <w:tcPr>
             <w:tcW w:w="9638" w:type="dxa"/>
@@ -2901,9 +2856,6 @@
   <w:p>
     <w:pPr>
       <w:ind w:right="840"/>
-      <w:rPr>
-        <w:rFonts w:hint="eastAsia"/>
-      </w:rPr>
     </w:pPr>
   </w:p>
 </w:hdr>

</xml_diff>